<commit_message>
Switch all tests to one-tailed; asterisks on p-values; NU/U results labels
Co-Authored-By: Claude Opus 5.5 <noreply@anthropic.com>
Claude-Session: https://claude.ai/code/session_017FiZmvLfGJBDjNeFsfBt4t
</commit_message>
<xml_diff>
--- a/LastName_FirstName_U2P.docx
+++ b/LastName_FirstName_U2P.docx
@@ -8165,7 +8165,7 @@
                 <w:rFonts w:asciiTheme="minorHAnsi" w:hAnsiTheme="minorHAnsi"/>
                 <w:sz w:val="20"/>
               </w:rPr>
-              <w:t>.494</w:t>
+              <w:t>.247</w:t>
             </w:r>
           </w:p>
         </w:tc>
@@ -8246,7 +8246,7 @@
                 <w:rFonts w:asciiTheme="minorHAnsi" w:hAnsiTheme="minorHAnsi"/>
                 <w:sz w:val="20"/>
               </w:rPr>
-              <w:t>.145</w:t>
+              <w:t>.073</w:t>
             </w:r>
           </w:p>
         </w:tc>
@@ -8496,7 +8496,7 @@
                 <w:rFonts w:asciiTheme="minorHAnsi" w:hAnsiTheme="minorHAnsi"/>
                 <w:sz w:val="20"/>
               </w:rPr>
-              <w:t>-3.43***</w:t>
+              <w:t>-3.43</w:t>
             </w:r>
           </w:p>
         </w:tc>
@@ -8523,7 +8523,7 @@
                 <w:rFonts w:asciiTheme="minorHAnsi" w:hAnsiTheme="minorHAnsi"/>
                 <w:sz w:val="20"/>
               </w:rPr>
-              <w:t>&lt;.001</w:t>
+              <w:t>&lt;.001***</w:t>
             </w:r>
           </w:p>
         </w:tc>
@@ -8550,7 +8550,7 @@
                 <w:rFonts w:asciiTheme="minorHAnsi" w:hAnsiTheme="minorHAnsi"/>
                 <w:sz w:val="20"/>
               </w:rPr>
-              <w:t>U &gt; NU</w:t>
+              <w:t>NU &lt; U</w:t>
             </w:r>
           </w:p>
         </w:tc>
@@ -8577,7 +8577,7 @@
                 <w:rFonts w:asciiTheme="minorHAnsi" w:hAnsiTheme="minorHAnsi"/>
                 <w:sz w:val="20"/>
               </w:rPr>
-              <w:t>1.50**</w:t>
+              <w:t>1.50</w:t>
             </w:r>
           </w:p>
         </w:tc>
@@ -8605,7 +8605,7 @@
                 <w:rFonts w:asciiTheme="minorHAnsi" w:hAnsiTheme="minorHAnsi"/>
                 <w:sz w:val="20"/>
               </w:rPr>
-              <w:t>.001</w:t>
+              <w:t>&lt;.001***</w:t>
             </w:r>
           </w:p>
         </w:tc>
@@ -8883,7 +8883,7 @@
                 <w:rFonts w:asciiTheme="minorHAnsi" w:hAnsiTheme="minorHAnsi"/>
                 <w:sz w:val="20"/>
               </w:rPr>
-              <w:t>.161</w:t>
+              <w:t>.081</w:t>
             </w:r>
           </w:p>
         </w:tc>
@@ -8964,7 +8964,7 @@
                 <w:rFonts w:asciiTheme="minorHAnsi" w:hAnsiTheme="minorHAnsi"/>
                 <w:sz w:val="20"/>
               </w:rPr>
-              <w:t>.310</w:t>
+              <w:t>.155</w:t>
             </w:r>
           </w:p>
         </w:tc>
@@ -9252,7 +9252,7 @@
                 <w:rFonts w:asciiTheme="minorHAnsi" w:hAnsiTheme="minorHAnsi"/>
                 <w:sz w:val="20"/>
               </w:rPr>
-              <w:t>-1.70†</w:t>
+              <w:t>-1.70</w:t>
             </w:r>
           </w:p>
         </w:tc>
@@ -9279,7 +9279,7 @@
                 <w:rFonts w:asciiTheme="minorHAnsi" w:hAnsiTheme="minorHAnsi"/>
                 <w:sz w:val="20"/>
               </w:rPr>
-              <w:t>.090</w:t>
+              <w:t>.045*</w:t>
             </w:r>
           </w:p>
         </w:tc>
@@ -9306,7 +9306,7 @@
                 <w:rFonts w:asciiTheme="minorHAnsi" w:hAnsiTheme="minorHAnsi"/>
                 <w:sz w:val="20"/>
               </w:rPr>
-              <w:t>U &gt; NU</w:t>
+              <w:t>NU &lt; U</w:t>
             </w:r>
           </w:p>
         </w:tc>
@@ -9361,7 +9361,7 @@
                 <w:rFonts w:asciiTheme="minorHAnsi" w:hAnsiTheme="minorHAnsi"/>
                 <w:sz w:val="20"/>
               </w:rPr>
-              <w:t>.576</w:t>
+              <w:t>.288</w:t>
             </w:r>
           </w:p>
         </w:tc>
@@ -9635,7 +9635,7 @@
                 <w:rFonts w:asciiTheme="minorHAnsi" w:hAnsiTheme="minorHAnsi"/>
                 <w:sz w:val="20"/>
               </w:rPr>
-              <w:t>-2.61**</w:t>
+              <w:t>-2.61</w:t>
             </w:r>
           </w:p>
         </w:tc>
@@ -9662,7 +9662,7 @@
                 <w:rFonts w:asciiTheme="minorHAnsi" w:hAnsiTheme="minorHAnsi"/>
                 <w:sz w:val="20"/>
               </w:rPr>
-              <w:t>.009</w:t>
+              <w:t>.005**</w:t>
             </w:r>
           </w:p>
         </w:tc>
@@ -9689,7 +9689,7 @@
                 <w:rFonts w:asciiTheme="minorHAnsi" w:hAnsiTheme="minorHAnsi"/>
                 <w:sz w:val="20"/>
               </w:rPr>
-              <w:t>U &gt; NU</w:t>
+              <w:t>NU &lt; U</w:t>
             </w:r>
           </w:p>
         </w:tc>
@@ -9744,7 +9744,7 @@
                 <w:rFonts w:asciiTheme="minorHAnsi" w:hAnsiTheme="minorHAnsi"/>
                 <w:sz w:val="20"/>
               </w:rPr>
-              <w:t>.164</w:t>
+              <w:t>.082</w:t>
             </w:r>
           </w:p>
         </w:tc>
@@ -10541,7 +10541,7 @@
                 <w:rFonts w:asciiTheme="minorHAnsi" w:hAnsiTheme="minorHAnsi"/>
                 <w:sz w:val="20"/>
               </w:rPr>
-              <w:t>4.25***</w:t>
+              <w:t>4.25</w:t>
             </w:r>
           </w:p>
         </w:tc>
@@ -10568,7 +10568,7 @@
                 <w:rFonts w:asciiTheme="minorHAnsi" w:hAnsiTheme="minorHAnsi"/>
                 <w:sz w:val="20"/>
               </w:rPr>
-              <w:t>&lt;.001</w:t>
+              <w:t>&lt;.001***</w:t>
             </w:r>
           </w:p>
         </w:tc>
@@ -10622,7 +10622,7 @@
                 <w:rFonts w:asciiTheme="minorHAnsi" w:hAnsiTheme="minorHAnsi"/>
                 <w:sz w:val="20"/>
               </w:rPr>
-              <w:t>1.85***</w:t>
+              <w:t>1.85</w:t>
             </w:r>
           </w:p>
         </w:tc>
@@ -10650,7 +10650,7 @@
                 <w:rFonts w:asciiTheme="minorHAnsi" w:hAnsiTheme="minorHAnsi"/>
                 <w:sz w:val="20"/>
               </w:rPr>
-              <w:t>&lt;.001</w:t>
+              <w:t>&lt;.001***</w:t>
             </w:r>
           </w:p>
         </w:tc>
@@ -10901,7 +10901,7 @@
                 <w:rFonts w:asciiTheme="minorHAnsi" w:hAnsiTheme="minorHAnsi"/>
                 <w:sz w:val="20"/>
               </w:rPr>
-              <w:t>1.69†</w:t>
+              <w:t>1.69</w:t>
             </w:r>
           </w:p>
         </w:tc>
@@ -10928,7 +10928,7 @@
                 <w:rFonts w:asciiTheme="minorHAnsi" w:hAnsiTheme="minorHAnsi"/>
                 <w:sz w:val="20"/>
               </w:rPr>
-              <w:t>.092</w:t>
+              <w:t>.046*</w:t>
             </w:r>
           </w:p>
         </w:tc>
@@ -11010,7 +11010,7 @@
                 <w:rFonts w:asciiTheme="minorHAnsi" w:hAnsiTheme="minorHAnsi"/>
                 <w:sz w:val="20"/>
               </w:rPr>
-              <w:t>.549</w:t>
+              <w:t>.275</w:t>
             </w:r>
           </w:p>
         </w:tc>
@@ -11287,7 +11287,7 @@
                 <w:rFonts w:asciiTheme="minorHAnsi" w:hAnsiTheme="minorHAnsi"/>
                 <w:sz w:val="20"/>
               </w:rPr>
-              <w:t>.445</w:t>
+              <w:t>.222</w:t>
             </w:r>
           </w:p>
         </w:tc>
@@ -11368,7 +11368,7 @@
                 <w:rFonts w:asciiTheme="minorHAnsi" w:hAnsiTheme="minorHAnsi"/>
                 <w:sz w:val="20"/>
               </w:rPr>
-              <w:t>.326</w:t>
+              <w:t>.163</w:t>
             </w:r>
           </w:p>
         </w:tc>
@@ -11645,7 +11645,7 @@
                 <w:rFonts w:asciiTheme="minorHAnsi" w:hAnsiTheme="minorHAnsi"/>
                 <w:sz w:val="20"/>
               </w:rPr>
-              <w:t>.563</w:t>
+              <w:t>.281</w:t>
             </w:r>
           </w:p>
         </w:tc>
@@ -11726,7 +11726,7 @@
                 <w:rFonts w:asciiTheme="minorHAnsi" w:hAnsiTheme="minorHAnsi"/>
                 <w:sz w:val="20"/>
               </w:rPr>
-              <w:t>.383</w:t>
+              <w:t>.191</w:t>
             </w:r>
           </w:p>
         </w:tc>
@@ -12569,7 +12569,7 @@
                 <w:rFonts w:asciiTheme="minorHAnsi" w:hAnsiTheme="minorHAnsi"/>
                 <w:sz w:val="20"/>
               </w:rPr>
-              <w:t>.357</w:t>
+              <w:t>.179</w:t>
             </w:r>
           </w:p>
         </w:tc>
@@ -12622,7 +12622,7 @@
                 <w:rFonts w:asciiTheme="minorHAnsi" w:hAnsiTheme="minorHAnsi"/>
                 <w:sz w:val="20"/>
               </w:rPr>
-              <w:t>1.42**</w:t>
+              <w:t>1.42</w:t>
             </w:r>
           </w:p>
         </w:tc>
@@ -12650,7 +12650,7 @@
                 <w:rFonts w:asciiTheme="minorHAnsi" w:hAnsiTheme="minorHAnsi"/>
                 <w:sz w:val="20"/>
               </w:rPr>
-              <w:t>.005</w:t>
+              <w:t>.003**</w:t>
             </w:r>
           </w:p>
         </w:tc>
@@ -12902,7 +12902,7 @@
                 <w:rFonts w:asciiTheme="minorHAnsi" w:hAnsiTheme="minorHAnsi"/>
                 <w:sz w:val="20"/>
               </w:rPr>
-              <w:t>-1.79†</w:t>
+              <w:t>-1.79</w:t>
             </w:r>
           </w:p>
         </w:tc>
@@ -12929,7 +12929,7 @@
                 <w:rFonts w:asciiTheme="minorHAnsi" w:hAnsiTheme="minorHAnsi"/>
                 <w:sz w:val="20"/>
               </w:rPr>
-              <w:t>.074</w:t>
+              <w:t>.037*</w:t>
             </w:r>
           </w:p>
         </w:tc>
@@ -12956,7 +12956,7 @@
                 <w:rFonts w:asciiTheme="minorHAnsi" w:hAnsiTheme="minorHAnsi"/>
                 <w:sz w:val="20"/>
               </w:rPr>
-              <w:t>U &gt; NU</w:t>
+              <w:t>NU &lt; U</w:t>
             </w:r>
           </w:p>
         </w:tc>
@@ -12983,7 +12983,7 @@
                 <w:rFonts w:asciiTheme="minorHAnsi" w:hAnsiTheme="minorHAnsi"/>
                 <w:sz w:val="20"/>
               </w:rPr>
-              <w:t>1.30*</w:t>
+              <w:t>1.30</w:t>
             </w:r>
           </w:p>
         </w:tc>
@@ -13011,7 +13011,7 @@
                 <w:rFonts w:asciiTheme="minorHAnsi" w:hAnsiTheme="minorHAnsi"/>
                 <w:sz w:val="20"/>
               </w:rPr>
-              <w:t>.036</w:t>
+              <w:t>.018*</w:t>
             </w:r>
           </w:p>
         </w:tc>
@@ -13262,7 +13262,7 @@
                 <w:rFonts w:asciiTheme="minorHAnsi" w:hAnsiTheme="minorHAnsi"/>
                 <w:sz w:val="20"/>
               </w:rPr>
-              <w:t>-2.73**</w:t>
+              <w:t>-2.73</w:t>
             </w:r>
           </w:p>
         </w:tc>
@@ -13289,7 +13289,7 @@
                 <w:rFonts w:asciiTheme="minorHAnsi" w:hAnsiTheme="minorHAnsi"/>
                 <w:sz w:val="20"/>
               </w:rPr>
-              <w:t>.007</w:t>
+              <w:t>.003**</w:t>
             </w:r>
           </w:p>
         </w:tc>
@@ -13316,7 +13316,7 @@
                 <w:rFonts w:asciiTheme="minorHAnsi" w:hAnsiTheme="minorHAnsi"/>
                 <w:sz w:val="20"/>
               </w:rPr>
-              <w:t>U &gt; NU</w:t>
+              <w:t>NU &lt; U</w:t>
             </w:r>
           </w:p>
         </w:tc>
@@ -13343,7 +13343,7 @@
                 <w:rFonts w:asciiTheme="minorHAnsi" w:hAnsiTheme="minorHAnsi"/>
                 <w:sz w:val="20"/>
               </w:rPr>
-              <w:t>1.23†</w:t>
+              <w:t>1.23</w:t>
             </w:r>
           </w:p>
         </w:tc>
@@ -13371,7 +13371,7 @@
                 <w:rFonts w:asciiTheme="minorHAnsi" w:hAnsiTheme="minorHAnsi"/>
                 <w:sz w:val="20"/>
               </w:rPr>
-              <w:t>.099</w:t>
+              <w:t>.050*</w:t>
             </w:r>
           </w:p>
         </w:tc>
@@ -13650,7 +13650,7 @@
                 <w:rFonts w:asciiTheme="minorHAnsi" w:hAnsiTheme="minorHAnsi"/>
                 <w:sz w:val="20"/>
               </w:rPr>
-              <w:t>.315</w:t>
+              <w:t>.158</w:t>
             </w:r>
           </w:p>
         </w:tc>
@@ -13731,7 +13731,7 @@
                 <w:rFonts w:asciiTheme="minorHAnsi" w:hAnsiTheme="minorHAnsi"/>
                 <w:sz w:val="20"/>
               </w:rPr>
-              <w:t>.309</w:t>
+              <w:t>.154</w:t>
             </w:r>
           </w:p>
         </w:tc>
@@ -13982,7 +13982,7 @@
                 <w:rFonts w:asciiTheme="minorHAnsi" w:hAnsiTheme="minorHAnsi"/>
                 <w:sz w:val="20"/>
               </w:rPr>
-              <w:t>-3.42***</w:t>
+              <w:t>-3.42</w:t>
             </w:r>
           </w:p>
         </w:tc>
@@ -14009,7 +14009,7 @@
                 <w:rFonts w:asciiTheme="minorHAnsi" w:hAnsiTheme="minorHAnsi"/>
                 <w:sz w:val="20"/>
               </w:rPr>
-              <w:t>&lt;.001</w:t>
+              <w:t>&lt;.001***</w:t>
             </w:r>
           </w:p>
         </w:tc>
@@ -14036,7 +14036,7 @@
                 <w:rFonts w:asciiTheme="minorHAnsi" w:hAnsiTheme="minorHAnsi"/>
                 <w:sz w:val="20"/>
               </w:rPr>
-              <w:t>U &gt; NU</w:t>
+              <w:t>NU &lt; U</w:t>
             </w:r>
           </w:p>
         </w:tc>
@@ -14063,7 +14063,7 @@
                 <w:rFonts w:asciiTheme="minorHAnsi" w:hAnsiTheme="minorHAnsi"/>
                 <w:sz w:val="20"/>
               </w:rPr>
-              <w:t>1.63***</w:t>
+              <w:t>1.63</w:t>
             </w:r>
           </w:p>
         </w:tc>
@@ -14091,7 +14091,7 @@
                 <w:rFonts w:asciiTheme="minorHAnsi" w:hAnsiTheme="minorHAnsi"/>
                 <w:sz w:val="20"/>
               </w:rPr>
-              <w:t>&lt;.001</w:t>
+              <w:t>&lt;.001***</w:t>
             </w:r>
           </w:p>
         </w:tc>
@@ -14343,7 +14343,7 @@
                 <w:rFonts w:asciiTheme="minorHAnsi" w:hAnsiTheme="minorHAnsi"/>
                 <w:sz w:val="20"/>
               </w:rPr>
-              <w:t>-2.99**</w:t>
+              <w:t>-2.99</w:t>
             </w:r>
           </w:p>
         </w:tc>
@@ -14370,7 +14370,7 @@
                 <w:rFonts w:asciiTheme="minorHAnsi" w:hAnsiTheme="minorHAnsi"/>
                 <w:sz w:val="20"/>
               </w:rPr>
-              <w:t>.003</w:t>
+              <w:t>.001**</w:t>
             </w:r>
           </w:p>
         </w:tc>
@@ -14397,7 +14397,7 @@
                 <w:rFonts w:asciiTheme="minorHAnsi" w:hAnsiTheme="minorHAnsi"/>
                 <w:sz w:val="20"/>
               </w:rPr>
-              <w:t>U &gt; NU</w:t>
+              <w:t>NU &lt; U</w:t>
             </w:r>
           </w:p>
         </w:tc>
@@ -14424,7 +14424,7 @@
                 <w:rFonts w:asciiTheme="minorHAnsi" w:hAnsiTheme="minorHAnsi"/>
                 <w:sz w:val="20"/>
               </w:rPr>
-              <w:t>1.31*</w:t>
+              <w:t>1.31</w:t>
             </w:r>
           </w:p>
         </w:tc>
@@ -14452,7 +14452,7 @@
                 <w:rFonts w:asciiTheme="minorHAnsi" w:hAnsiTheme="minorHAnsi"/>
                 <w:sz w:val="20"/>
               </w:rPr>
-              <w:t>.033</w:t>
+              <w:t>.017*</w:t>
             </w:r>
           </w:p>
         </w:tc>
@@ -14706,7 +14706,7 @@
                 <w:rFonts w:asciiTheme="minorHAnsi" w:hAnsiTheme="minorHAnsi"/>
                 <w:sz w:val="20"/>
               </w:rPr>
-              <w:t>5.01***</w:t>
+              <w:t>5.01</w:t>
             </w:r>
           </w:p>
         </w:tc>
@@ -14733,7 +14733,7 @@
                 <w:rFonts w:asciiTheme="minorHAnsi" w:hAnsiTheme="minorHAnsi"/>
                 <w:sz w:val="20"/>
               </w:rPr>
-              <w:t>&lt;.001</w:t>
+              <w:t>&lt;.001***</w:t>
             </w:r>
           </w:p>
         </w:tc>
@@ -14815,7 +14815,7 @@
                 <w:rFonts w:asciiTheme="minorHAnsi" w:hAnsiTheme="minorHAnsi"/>
                 <w:sz w:val="20"/>
               </w:rPr>
-              <w:t>.377</w:t>
+              <w:t>.188</w:t>
             </w:r>
           </w:p>
         </w:tc>
@@ -14869,7 +14869,7 @@
           <w:i/>
           <w:iCs/>
         </w:rPr>
-        <w:t>1; One-tailed test: †. Results: U = Utah, NU = Not Utah (variation results show which group has the larger variance).</w:t>
+        <w:t>1. All tests are one-tailed. Results: NU = Not Utah, U = Utah (for variation, the group with the larger variance is shown as greater).</w:t>
       </w:r>
     </w:p>
     <w:p/>
@@ -15927,7 +15927,7 @@
                 <w:iCs/>
                 <w:sz w:val="20"/>
               </w:rPr>
-              <w:t>-1.97*</w:t>
+              <w:t>-1.97</w:t>
             </w:r>
           </w:p>
         </w:tc>
@@ -15958,7 +15958,7 @@
                 <w:iCs/>
                 <w:sz w:val="20"/>
               </w:rPr>
-              <w:t>.049</w:t>
+              <w:t>.025*</w:t>
             </w:r>
           </w:p>
         </w:tc>
@@ -15989,7 +15989,7 @@
                 <w:iCs/>
                 <w:sz w:val="20"/>
               </w:rPr>
-              <w:t>Female Not Utah &gt; Female Utah</w:t>
+              <w:t>FU &lt; FNU</w:t>
             </w:r>
           </w:p>
         </w:tc>
@@ -16221,7 +16221,7 @@
                 <w:iCs/>
                 <w:sz w:val="20"/>
               </w:rPr>
-              <w:t>.920</w:t>
+              <w:t>.460</w:t>
             </w:r>
           </w:p>
         </w:tc>
@@ -16452,7 +16452,7 @@
                 <w:iCs/>
                 <w:sz w:val="20"/>
               </w:rPr>
-              <w:t>-2.16*</w:t>
+              <w:t>-2.16</w:t>
             </w:r>
           </w:p>
         </w:tc>
@@ -16483,7 +16483,7 @@
                 <w:iCs/>
                 <w:sz w:val="20"/>
               </w:rPr>
-              <w:t>.031</w:t>
+              <w:t>.015*</w:t>
             </w:r>
           </w:p>
         </w:tc>
@@ -16514,7 +16514,7 @@
                 <w:iCs/>
                 <w:sz w:val="20"/>
               </w:rPr>
-              <w:t>Female Not Utah &gt; Female Utah</w:t>
+              <w:t>FU &lt; FNU</w:t>
             </w:r>
           </w:p>
         </w:tc>
@@ -16716,7 +16716,7 @@
                 <w:iCs/>
                 <w:sz w:val="20"/>
               </w:rPr>
-              <w:t>-1.65†</w:t>
+              <w:t>-1.65</w:t>
             </w:r>
           </w:p>
         </w:tc>
@@ -16747,7 +16747,7 @@
                 <w:iCs/>
                 <w:sz w:val="20"/>
               </w:rPr>
-              <w:t>.099</w:t>
+              <w:t>.050*</w:t>
             </w:r>
           </w:p>
         </w:tc>
@@ -16778,7 +16778,7 @@
                 <w:iCs/>
                 <w:sz w:val="20"/>
               </w:rPr>
-              <w:t>Female Not Utah &gt; Female Utah</w:t>
+              <w:t>FU &lt; FNU</w:t>
             </w:r>
           </w:p>
         </w:tc>
@@ -16979,7 +16979,7 @@
                 <w:iCs/>
                 <w:sz w:val="20"/>
               </w:rPr>
-              <w:t>2.20*</w:t>
+              <w:t>2.20</w:t>
             </w:r>
           </w:p>
         </w:tc>
@@ -17010,7 +17010,7 @@
                 <w:iCs/>
                 <w:sz w:val="20"/>
               </w:rPr>
-              <w:t>.028</w:t>
+              <w:t>.014*</w:t>
             </w:r>
           </w:p>
         </w:tc>
@@ -17041,7 +17041,7 @@
                 <w:iCs/>
                 <w:sz w:val="20"/>
               </w:rPr>
-              <w:t>Female Utah &gt; Female Not Utah</w:t>
+              <w:t>FU &gt; FNU</w:t>
             </w:r>
           </w:p>
         </w:tc>
@@ -17060,7 +17060,7 @@
           <w:i/>
           <w:iCs/>
         </w:rPr>
-        <w:t>Note: Significance levels: *p&lt;.05; **p&lt;.01; ***p&lt;.001; One-tailed test: †</w:t>
+        <w:t>Note: Significance levels: *p&lt;.05; **p&lt;.01; ***p&lt;.001. All tests are one-tailed. Results: FU = Female Utah, FNU = Female Not Utah.</w:t>
       </w:r>
     </w:p>
     <w:p>
@@ -17189,7 +17189,7 @@
         <w:t xml:space="preserve">Finding 1 – Utah respondents earn less but are more satisfied. </w:t>
       </w:r>
       <w:r>
-        <w:t>Respondents outside Utah reported significantly higher incomes than Utah respondents ($151.70k vs. $106.87k; t = 4.25, p &lt; .001), and their incomes were also significantly more spread out (F = 1.85, p &lt; .001). Even so, Utah respondents reported significantly higher job satisfaction (7.76 vs. 7.26; t = −2.61, p = .009). I found this interesting because it suggests that pay is not the main driver of satisfaction in this sample; intrinsic rewards such as autonomy (4.15 vs. 3.86; t = −3.43, p &lt; .001) appear to matter more.</w:t>
+        <w:t>Respondents outside Utah reported significantly higher incomes than Utah respondents ($151.70k vs. $106.87k; t = 4.25, p &lt; .001), and their incomes were also significantly more spread out (F = 1.85, p &lt; .001). Even so, Utah respondents reported significantly higher job satisfaction (7.76 vs. 7.26; t = −2.61, p = .005). I found this interesting because it suggests that pay is not the main driver of satisfaction in this sample; intrinsic rewards such as autonomy (4.15 vs. 3.86; t = −3.43, p &lt; .001) appear to matter more.</w:t>
       </w:r>
     </w:p>
     <w:p>
@@ -17200,7 +17200,7 @@
         <w:t xml:space="preserve">Finding 2 – Utah respondents are much less likely to be planning an exit. </w:t>
       </w:r>
       <w:r>
-        <w:t>Turnover intentions were significantly lower in Utah (4.30 vs. 5.48; t = 5.01, p &lt; .001), and Utah respondents also reported significantly higher organizational commitment (5.41 vs. 5.00; t = −2.73, p = .007), more respect at work (8.17 vs. 7.66; p &lt; .001), and more empathetic leaders (7.79 vs. 7.26; p = .003). I found this interesting because these results fit together: people who feel respected and supported by their leaders are more willing to stay, even when they are paid less.</w:t>
+        <w:t>Turnover intentions were significantly lower in Utah (4.30 vs. 5.48; t = 5.01, p &lt; .001), and Utah respondents also reported significantly higher organizational commitment (5.41 vs. 5.00; t = −2.73, p = .003), more respect at work (8.17 vs. 7.66; p &lt; .001), and more empathetic leaders (7.79 vs. 7.26; p = .002). I found this interesting because these results fit together: people who feel respected and supported by their leaders are more willing to stay, even when they are paid less.</w:t>
       </w:r>
     </w:p>
     <w:p>
@@ -17211,7 +17211,7 @@
         <w:t xml:space="preserve">Finding 3 – Female Utah respondents differ from other women in income, sales roles, and marriage. </w:t>
       </w:r>
       <w:r>
-        <w:t>Only 28.7% of female Utah respondents earned more than $100,000, compared with 40.3% of women outside Utah (z = −1.97, p = .049), and female Utah respondents were less likely to work in sales or business development (19.8% vs. 31.6%; z = −2.16, p = .031). At the same time, they were significantly more likely to be married or cohabitating (61.4% vs. 48.0%; z = 2.20, p = .028). I found this interesting because it is consistent with Utah’s family-centered culture and may help explain part of the income gap, although college-degree rates were almost identical (46.5% vs. 45.9%; p = .920), so education does not explain the difference.</w:t>
+        <w:t>Only 28.7% of female Utah respondents earned more than $100,000, compared with 40.3% of women outside Utah (z = −1.97, p = .025), and female Utah respondents were less likely to work in sales or business development (19.8% vs. 31.6%; z = −2.16, p = .015). At the same time, they were significantly more likely to be married or cohabitating (61.4% vs. 48.0%; z = 2.20, p = .014). I found this interesting because it is consistent with Utah’s family-centered culture and may help explain part of the income gap, although college-degree rates were almost identical (46.5% vs. 45.9%; p = .460), so education does not explain the difference.</w:t>
       </w:r>
     </w:p>
     <w:sectPr>

</xml_diff>